<commit_message>
docs: extend portable Chinese task template for planning and review
</commit_message>
<xml_diff>
--- a/human/templates/通用中文逐包任务总结模板.docx
+++ b/human/templates/通用中文逐包任务总结模板.docx
@@ -7,12 +7,17 @@
         <w:pStyle w:val="Title"/>
       </w:pPr>
       <w:r>
-        <w:t>逐包任务总结</w:t>
+        <w:t>逐包任务执行与审阅</w:t>
       </w:r>
     </w:p>
     <w:p>
       <w:r>
         <w:t>项目［项目名称］    任务［编号与领域］    当前文档［版本与日期］</w:t>
+      </w:r>
+    </w:p>
+    <w:p>
+      <w:r>
+        <w:t>启动填目标与计划，执行记实际进展，收尾填交付与验收。未执行的计划不写成结果。</w:t>
       </w:r>
     </w:p>
     <w:p>
@@ -381,6 +386,16 @@
       </w:r>
     </w:p>
     <w:p>
+      <w:r>
+        <w:t>领取与启动：［负责人、领取日期、预计工作量；必须具备的上游输入及当前是否齐备。］</w:t>
+      </w:r>
+    </w:p>
+    <w:p>
+      <w:r>
+        <w:t>技能与学习资料：［只列完成本包必需的技能、工具版本与可点击资料链接；中文教学优先，接口行为以官方资料为准。］</w:t>
+      </w:r>
+    </w:p>
+    <w:p>
       <w:pPr>
         <w:pStyle w:val="Heading1"/>
       </w:pPr>
@@ -592,6 +607,137 @@
           </w:p>
         </w:tc>
       </w:tr>
+    </w:tbl>
+    <w:p>
+      <w:r>
+        <w:br w:type="page"/>
+      </w:r>
+    </w:p>
+    <w:p>
+      <w:pPr>
+        <w:pStyle w:val="Heading1"/>
+      </w:pPr>
+      <w:r>
+        <w:t>四 执行过程与关键决定</w:t>
+      </w:r>
+    </w:p>
+    <w:p>
+      <w:r>
+        <w:t>输入与前提：［列出本次真正使用的输入、设备、数据或上游结果。］</w:t>
+      </w:r>
+    </w:p>
+    <w:p>
+      <w:r>
+        <w:t>关键决定：［写最终采用的方案、直接理由与项目约束；有必要才记录替代方案。］</w:t>
+      </w:r>
+    </w:p>
+    <w:tbl>
+      <w:tblPr>
+        <w:tblW w:type="auto" w:w="0"/>
+        <w:jc w:val="center"/>
+        <w:tblLayout w:type="fixed"/>
+        <w:tblLook w:firstColumn="1" w:firstRow="1" w:lastColumn="0" w:lastRow="0" w:noHBand="0" w:noVBand="1" w:val="04A0"/>
+      </w:tblPr>
+      <w:tblGrid>
+        <w:gridCol w:w="2592"/>
+        <w:gridCol w:w="4464"/>
+        <w:gridCol w:w="3024"/>
+      </w:tblGrid>
+      <w:tr>
+        <w:tc>
+          <w:tcPr>
+            <w:tcW w:type="dxa" w:w="2592"/>
+            <w:vAlign w:val="center"/>
+            <w:tcBorders>
+              <w:top w:val="single" w:sz="4" w:color="D9D9D9"/>
+              <w:bottom w:val="single" w:sz="4" w:color="D9D9D9"/>
+              <w:left w:val="single" w:sz="4" w:color="D9D9D9"/>
+              <w:right w:val="single" w:sz="4" w:color="D9D9D9"/>
+            </w:tcBorders>
+            <w:tcMar>
+              <w:top w:w="90" w:type="dxa"/>
+              <w:bottom w:w="90" w:type="dxa"/>
+              <w:left w:w="90" w:type="dxa"/>
+              <w:right w:w="90" w:type="dxa"/>
+            </w:tcMar>
+            <w:shd w:fill="E8EEF4"/>
+          </w:tcPr>
+          <w:p>
+            <w:pPr>
+              <w:spacing w:after="60" w:line="264" w:lineRule="auto"/>
+            </w:pPr>
+            <w:r>
+              <w:rPr>
+                <w:b/>
+                <w:sz w:val="19"/>
+              </w:rPr>
+              <w:t>步骤与责任人</w:t>
+            </w:r>
+          </w:p>
+        </w:tc>
+        <w:tc>
+          <w:tcPr>
+            <w:tcW w:type="dxa" w:w="4464"/>
+            <w:vAlign w:val="center"/>
+            <w:tcBorders>
+              <w:top w:val="single" w:sz="4" w:color="D9D9D9"/>
+              <w:bottom w:val="single" w:sz="4" w:color="D9D9D9"/>
+              <w:left w:val="single" w:sz="4" w:color="D9D9D9"/>
+              <w:right w:val="single" w:sz="4" w:color="D9D9D9"/>
+            </w:tcBorders>
+            <w:tcMar>
+              <w:top w:w="90" w:type="dxa"/>
+              <w:bottom w:w="90" w:type="dxa"/>
+              <w:left w:w="90" w:type="dxa"/>
+              <w:right w:w="90" w:type="dxa"/>
+            </w:tcMar>
+            <w:shd w:fill="E8EEF4"/>
+          </w:tcPr>
+          <w:p>
+            <w:pPr>
+              <w:spacing w:after="60" w:line="264" w:lineRule="auto"/>
+            </w:pPr>
+            <w:r>
+              <w:rPr>
+                <w:b/>
+                <w:sz w:val="19"/>
+              </w:rPr>
+              <w:t>预期产出与检查</w:t>
+            </w:r>
+          </w:p>
+        </w:tc>
+        <w:tc>
+          <w:tcPr>
+            <w:tcW w:type="dxa" w:w="3024"/>
+            <w:vAlign w:val="center"/>
+            <w:tcBorders>
+              <w:top w:val="single" w:sz="4" w:color="D9D9D9"/>
+              <w:bottom w:val="single" w:sz="4" w:color="D9D9D9"/>
+              <w:left w:val="single" w:sz="4" w:color="D9D9D9"/>
+              <w:right w:val="single" w:sz="4" w:color="D9D9D9"/>
+            </w:tcBorders>
+            <w:tcMar>
+              <w:top w:w="90" w:type="dxa"/>
+              <w:bottom w:w="90" w:type="dxa"/>
+              <w:left w:w="90" w:type="dxa"/>
+              <w:right w:w="90" w:type="dxa"/>
+            </w:tcMar>
+            <w:shd w:fill="E8EEF4"/>
+          </w:tcPr>
+          <w:p>
+            <w:pPr>
+              <w:spacing w:after="60" w:line="264" w:lineRule="auto"/>
+            </w:pPr>
+            <w:r>
+              <w:rPr>
+                <w:b/>
+                <w:sz w:val="19"/>
+              </w:rPr>
+              <w:t>实际进展</w:t>
+            </w:r>
+          </w:p>
+        </w:tc>
+      </w:tr>
       <w:tr>
         <w:tc>
           <w:tcPr>
@@ -619,13 +765,13 @@
                 <w:b w:val="0"/>
                 <w:sz w:val="19"/>
               </w:rPr>
-              <w:t>［交付名称］</w:t>
+              <w:t>1 ［输入确认；负责人］</w:t>
             </w:r>
           </w:p>
         </w:tc>
         <w:tc>
           <w:tcPr>
-            <w:tcW w:type="dxa" w:w="5472"/>
+            <w:tcW w:type="dxa" w:w="4464"/>
             <w:vAlign w:val="center"/>
             <w:tcBorders>
               <w:top w:val="single" w:sz="4" w:color="D9D9D9"/>
@@ -649,13 +795,13 @@
                 <w:b w:val="0"/>
                 <w:sz w:val="19"/>
               </w:rPr>
-              <w:t>［文件或入口］</w:t>
+              <w:t>［必需输入与启动条件］</w:t>
             </w:r>
           </w:p>
         </w:tc>
         <w:tc>
           <w:tcPr>
-            <w:tcW w:type="dxa" w:w="2016"/>
+            <w:tcW w:type="dxa" w:w="3024"/>
             <w:vAlign w:val="center"/>
             <w:tcBorders>
               <w:top w:val="single" w:sz="4" w:color="D9D9D9"/>
@@ -679,40 +825,196 @@
                 <w:b w:val="0"/>
                 <w:sz w:val="19"/>
               </w:rPr>
-              <w:t>［AC编号及结果］</w:t>
+              <w:t>［未执行／进行中／完成及日期］</w:t>
+            </w:r>
+          </w:p>
+        </w:tc>
+      </w:tr>
+      <w:tr>
+        <w:tc>
+          <w:tcPr>
+            <w:tcW w:type="dxa" w:w="2592"/>
+            <w:vAlign w:val="center"/>
+            <w:tcBorders>
+              <w:top w:val="single" w:sz="4" w:color="D9D9D9"/>
+              <w:bottom w:val="single" w:sz="4" w:color="D9D9D9"/>
+              <w:left w:val="single" w:sz="4" w:color="D9D9D9"/>
+              <w:right w:val="single" w:sz="4" w:color="D9D9D9"/>
+            </w:tcBorders>
+            <w:tcMar>
+              <w:top w:w="90" w:type="dxa"/>
+              <w:bottom w:w="90" w:type="dxa"/>
+              <w:left w:w="90" w:type="dxa"/>
+              <w:right w:w="90" w:type="dxa"/>
+            </w:tcMar>
+          </w:tcPr>
+          <w:p>
+            <w:pPr>
+              <w:spacing w:after="60" w:line="264" w:lineRule="auto"/>
+            </w:pPr>
+            <w:r>
+              <w:rPr>
+                <w:b w:val="0"/>
+                <w:sz w:val="19"/>
+              </w:rPr>
+              <w:t>2 ［实施；负责人］</w:t>
+            </w:r>
+          </w:p>
+        </w:tc>
+        <w:tc>
+          <w:tcPr>
+            <w:tcW w:type="dxa" w:w="4464"/>
+            <w:vAlign w:val="center"/>
+            <w:tcBorders>
+              <w:top w:val="single" w:sz="4" w:color="D9D9D9"/>
+              <w:bottom w:val="single" w:sz="4" w:color="D9D9D9"/>
+              <w:left w:val="single" w:sz="4" w:color="D9D9D9"/>
+              <w:right w:val="single" w:sz="4" w:color="D9D9D9"/>
+            </w:tcBorders>
+            <w:tcMar>
+              <w:top w:w="90" w:type="dxa"/>
+              <w:bottom w:w="90" w:type="dxa"/>
+              <w:left w:w="90" w:type="dxa"/>
+              <w:right w:w="90" w:type="dxa"/>
+            </w:tcMar>
+          </w:tcPr>
+          <w:p>
+            <w:pPr>
+              <w:spacing w:after="60" w:line="264" w:lineRule="auto"/>
+            </w:pPr>
+            <w:r>
+              <w:rPr>
+                <w:b w:val="0"/>
+                <w:sz w:val="19"/>
+              </w:rPr>
+              <w:t>［最小交付及对应AC］</w:t>
+            </w:r>
+          </w:p>
+        </w:tc>
+        <w:tc>
+          <w:tcPr>
+            <w:tcW w:type="dxa" w:w="3024"/>
+            <w:vAlign w:val="center"/>
+            <w:tcBorders>
+              <w:top w:val="single" w:sz="4" w:color="D9D9D9"/>
+              <w:bottom w:val="single" w:sz="4" w:color="D9D9D9"/>
+              <w:left w:val="single" w:sz="4" w:color="D9D9D9"/>
+              <w:right w:val="single" w:sz="4" w:color="D9D9D9"/>
+            </w:tcBorders>
+            <w:tcMar>
+              <w:top w:w="90" w:type="dxa"/>
+              <w:bottom w:w="90" w:type="dxa"/>
+              <w:left w:w="90" w:type="dxa"/>
+              <w:right w:w="90" w:type="dxa"/>
+            </w:tcMar>
+          </w:tcPr>
+          <w:p>
+            <w:pPr>
+              <w:spacing w:after="60" w:line="264" w:lineRule="auto"/>
+            </w:pPr>
+            <w:r>
+              <w:rPr>
+                <w:b w:val="0"/>
+                <w:sz w:val="19"/>
+              </w:rPr>
+              <w:t>［实际完成内容或问题］</w:t>
+            </w:r>
+          </w:p>
+        </w:tc>
+      </w:tr>
+      <w:tr>
+        <w:tc>
+          <w:tcPr>
+            <w:tcW w:type="dxa" w:w="2592"/>
+            <w:vAlign w:val="center"/>
+            <w:tcBorders>
+              <w:top w:val="single" w:sz="4" w:color="D9D9D9"/>
+              <w:bottom w:val="single" w:sz="4" w:color="D9D9D9"/>
+              <w:left w:val="single" w:sz="4" w:color="D9D9D9"/>
+              <w:right w:val="single" w:sz="4" w:color="D9D9D9"/>
+            </w:tcBorders>
+            <w:tcMar>
+              <w:top w:w="90" w:type="dxa"/>
+              <w:bottom w:w="90" w:type="dxa"/>
+              <w:left w:w="90" w:type="dxa"/>
+              <w:right w:w="90" w:type="dxa"/>
+            </w:tcMar>
+          </w:tcPr>
+          <w:p>
+            <w:pPr>
+              <w:spacing w:after="60" w:line="264" w:lineRule="auto"/>
+            </w:pPr>
+            <w:r>
+              <w:rPr>
+                <w:b w:val="0"/>
+                <w:sz w:val="19"/>
+              </w:rPr>
+              <w:t>3 ［验证交接；负责人］</w:t>
+            </w:r>
+          </w:p>
+        </w:tc>
+        <w:tc>
+          <w:tcPr>
+            <w:tcW w:type="dxa" w:w="4464"/>
+            <w:vAlign w:val="center"/>
+            <w:tcBorders>
+              <w:top w:val="single" w:sz="4" w:color="D9D9D9"/>
+              <w:bottom w:val="single" w:sz="4" w:color="D9D9D9"/>
+              <w:left w:val="single" w:sz="4" w:color="D9D9D9"/>
+              <w:right w:val="single" w:sz="4" w:color="D9D9D9"/>
+            </w:tcBorders>
+            <w:tcMar>
+              <w:top w:w="90" w:type="dxa"/>
+              <w:bottom w:w="90" w:type="dxa"/>
+              <w:left w:w="90" w:type="dxa"/>
+              <w:right w:w="90" w:type="dxa"/>
+            </w:tcMar>
+          </w:tcPr>
+          <w:p>
+            <w:pPr>
+              <w:spacing w:after="60" w:line="264" w:lineRule="auto"/>
+            </w:pPr>
+            <w:r>
+              <w:rPr>
+                <w:b w:val="0"/>
+                <w:sz w:val="19"/>
+              </w:rPr>
+              <w:t>［复测、审阅与交接条件］</w:t>
+            </w:r>
+          </w:p>
+        </w:tc>
+        <w:tc>
+          <w:tcPr>
+            <w:tcW w:type="dxa" w:w="3024"/>
+            <w:vAlign w:val="center"/>
+            <w:tcBorders>
+              <w:top w:val="single" w:sz="4" w:color="D9D9D9"/>
+              <w:bottom w:val="single" w:sz="4" w:color="D9D9D9"/>
+              <w:left w:val="single" w:sz="4" w:color="D9D9D9"/>
+              <w:right w:val="single" w:sz="4" w:color="D9D9D9"/>
+            </w:tcBorders>
+            <w:tcMar>
+              <w:top w:w="90" w:type="dxa"/>
+              <w:bottom w:w="90" w:type="dxa"/>
+              <w:left w:w="90" w:type="dxa"/>
+              <w:right w:w="90" w:type="dxa"/>
+            </w:tcMar>
+          </w:tcPr>
+          <w:p>
+            <w:pPr>
+              <w:spacing w:after="60" w:line="264" w:lineRule="auto"/>
+            </w:pPr>
+            <w:r>
+              <w:rPr>
+                <w:b w:val="0"/>
+                <w:sz w:val="19"/>
+              </w:rPr>
+              <w:t>［真实结果或剩余动作］</w:t>
             </w:r>
           </w:p>
         </w:tc>
       </w:tr>
     </w:tbl>
-    <w:p>
-      <w:r>
-        <w:br w:type="page"/>
-      </w:r>
-    </w:p>
-    <w:p>
-      <w:pPr>
-        <w:pStyle w:val="Heading1"/>
-      </w:pPr>
-      <w:r>
-        <w:t>四 执行过程与关键决定</w:t>
-      </w:r>
-    </w:p>
-    <w:p>
-      <w:r>
-        <w:t>输入与前提：［列出本次真正使用的输入、设备、数据或上游结果。］</w:t>
-      </w:r>
-    </w:p>
-    <w:p>
-      <w:r>
-        <w:t>推进过程：［按实际步骤写输入读取、实现、检查和收尾；不要复制未执行计划。］</w:t>
-      </w:r>
-    </w:p>
-    <w:p>
-      <w:r>
-        <w:t>关键决定：［写最终采用的方案、直接理由与项目约束；有必要才记录替代方案。］</w:t>
-      </w:r>
-    </w:p>
     <w:p>
       <w:pPr>
         <w:pStyle w:val="Heading1"/>
@@ -1366,6 +1668,11 @@
     </w:p>
     <w:p>
       <w:r>
+        <w:t>科研或论文作用：［本包支持哪条研究问题或主张，需要何种结果支撑；非科研任务写不适用，工具完成不等于研究结论成立。］</w:t>
+      </w:r>
+    </w:p>
+    <w:p>
+      <w:r>
         <w:t>上游实际输入：［上游编号、真实交付、版本要求及缺口。］</w:t>
       </w:r>
     </w:p>
@@ -1759,7 +2066,7 @@
       <w:pStyle w:val="Footer"/>
     </w:pPr>
     <w:r>
-      <w:t xml:space="preserve">通用中文模板 v1.0    </w:t>
+      <w:t xml:space="preserve">通用中文模板 v1.1    </w:t>
     </w:r>
     <w:fldSimple w:instr="PAGE"/>
   </w:p>
@@ -1771,7 +2078,7 @@
   <w:p>
     <w:pPr/>
     <w:r>
-      <w:t>逐包任务总结    人类审阅版本</w:t>
+      <w:t>逐包任务执行与审阅    通用中文模板</w:t>
     </w:r>
   </w:p>
 </w:hdr>

</xml_diff>